<commit_message>
docs: note existing SAP test server and read-only SQL access as low-cost start
Co-Authored-By: Claude Sonnet 5.5 <noreply@anthropic.com>
Claude-Session: https://claude.ai/code/session_01XnHPNus2M246HJdRhPqF5E
</commit_message>
<xml_diff>
--- a/10-Strategy/management-proposal-2026-10/Marindustrial_Management_Proposal.docx
+++ b/10-Strategy/management-proposal-2026-10/Marindustrial_Management_Proposal.docx
@@ -2639,7 +2639,7 @@
                 <w:color w:val="1F3640"/>
                 <w:sz w:val="18"/>
               </w:rPr>
-              <w:t xml:space="preserve"> Which features are live must be confirmed against the implementation repository. SAP test-server access and an integration licence are still needed.</w:t>
+              <w:t xml:space="preserve"> Which features are live must be confirmed against the implementation repository. Testing can use the existing SAP test server; any licence for posting into SAP is still to be confirmed.</w:t>
             </w:r>
           </w:p>
         </w:tc>
@@ -3587,6 +3587,36 @@
           <w:color w:val="118B92"/>
           <w:sz w:val="19"/>
         </w:rPr>
+        <w:t>WHY THE STARTING COST IS LOW</w:t>
+      </w:r>
+    </w:p>
+    <w:p>
+      <w:pPr>
+        <w:spacing w:after="180" w:line="281" w:lineRule="auto"/>
+      </w:pPr>
+      <w:r>
+        <w:rPr>
+          <w:rFonts w:ascii="Aptos" w:hAnsi="Aptos"/>
+          <w:b w:val="0"/>
+          <w:i w:val="0"/>
+          <w:color w:val="1F3640"/>
+          <w:sz w:val="18"/>
+        </w:rPr>
+        <w:t>Marindustrial already has an SAP test server, so features can be tested without a new environment or purchase. With a read-only SQL username and password, approved by IT, the proposer could extract SAP data automatically for testing and reporting at no additional software cost expected. Writing back into SAP is a separate later step that would need IT and SAP agreement and may need a licence.</w:t>
+      </w:r>
+    </w:p>
+    <w:p>
+      <w:pPr>
+        <w:spacing w:before="180" w:after="160" w:line="274" w:lineRule="auto"/>
+      </w:pPr>
+      <w:r>
+        <w:rPr>
+          <w:rFonts w:ascii="Aptos" w:hAnsi="Aptos"/>
+          <w:b/>
+          <w:i w:val="0"/>
+          <w:color w:val="118B92"/>
+          <w:sz w:val="19"/>
+        </w:rPr>
         <w:t>INVESTMENT DISCIPLINE</w:t>
       </w:r>
     </w:p>
@@ -3950,7 +3980,7 @@
           <w:color w:val="1F3640"/>
           <w:sz w:val="18"/>
         </w:rPr>
-        <w:t>•  Permit appropriate data access and staff participation, including a SAP test environment, subject to IT and SAP policies.</w:t>
+        <w:t>•  Permit use of the existing SAP test server and read-only SQL access to SAP data, and staff participation, subject to IT and SAP policies.</w:t>
       </w:r>
     </w:p>
     <w:p>
@@ -4016,6 +4046,41 @@
           <w:sz w:val="18"/>
         </w:rPr>
         <w:t xml:space="preserve"> Shipping runs as a standalone tool first, so value does not depend on SAP access.</w:t>
+      </w:r>
+    </w:p>
+    <w:p>
+      <w:pPr>
+        <w:spacing w:after="120" w:line="281" w:lineRule="auto"/>
+      </w:pPr>
+      <w:r>
+        <w:rPr>
+          <w:rFonts w:ascii="Aptos" w:hAnsi="Aptos"/>
+          <w:b w:val="0"/>
+          <w:i w:val="0"/>
+          <w:color w:val="1F3640"/>
+          <w:sz w:val="18"/>
+        </w:rPr>
+        <w:t xml:space="preserve">•  </w:t>
+      </w:r>
+      <w:r>
+        <w:rPr>
+          <w:rFonts w:ascii="Aptos" w:hAnsi="Aptos"/>
+          <w:b/>
+          <w:i w:val="0"/>
+          <w:color w:val="193544"/>
+          <w:sz w:val="18"/>
+        </w:rPr>
+        <w:t>Data access risk.</w:t>
+      </w:r>
+      <w:r>
+        <w:rPr>
+          <w:rFonts w:ascii="Aptos" w:hAnsi="Aptos"/>
+          <w:b w:val="0"/>
+          <w:i w:val="0"/>
+          <w:color w:val="1F3640"/>
+          <w:sz w:val="18"/>
+        </w:rPr>
+        <w:t xml:space="preserve"> Access is read-only and tested on the SAP test server first. Nothing is written to production SAP without IT and SAP acceptance.</w:t>
       </w:r>
     </w:p>
     <w:p>

</xml_diff>

<commit_message>
docs: add commercialization gain and future-opportunities appendix (8 pages)
Co-Authored-By: Claude Sonnet 5.5 <noreply@anthropic.com>
Claude-Session: https://claude.ai/code/session_01XnHPNus2M246HJdRhPqF5E
</commit_message>
<xml_diff>
--- a/10-Strategy/management-proposal-2026-10/Marindustrial_Management_Proposal.docx
+++ b/10-Strategy/management-proposal-2026-10/Marindustrial_Management_Proposal.docx
@@ -14,7 +14,7 @@
           <w:color w:val="118B92"/>
           <w:sz w:val="16"/>
         </w:rPr>
-        <w:t>MANAGEMENT BRIEF  /  OCTOBER 2026    •    01/07</w:t>
+        <w:t>MANAGEMENT BRIEF  /  OCTOBER 2026    •    01/08</w:t>
       </w:r>
     </w:p>
     <w:p>
@@ -267,6 +267,41 @@
     </w:p>
     <w:p>
       <w:pPr>
+        <w:spacing w:after="120" w:line="281" w:lineRule="auto"/>
+      </w:pPr>
+      <w:r>
+        <w:rPr>
+          <w:rFonts w:ascii="Aptos" w:hAnsi="Aptos"/>
+          <w:b w:val="0"/>
+          <w:i w:val="0"/>
+          <w:color w:val="1F3640"/>
+          <w:sz w:val="18"/>
+        </w:rPr>
+        <w:t xml:space="preserve">•  </w:t>
+      </w:r>
+      <w:r>
+        <w:rPr>
+          <w:rFonts w:ascii="Aptos" w:hAnsi="Aptos"/>
+          <w:b/>
+          <w:i w:val="0"/>
+          <w:color w:val="193544"/>
+          <w:sz w:val="18"/>
+        </w:rPr>
+        <w:t>A possible long-term product opportunity.</w:t>
+      </w:r>
+      <w:r>
+        <w:rPr>
+          <w:rFonts w:ascii="Aptos" w:hAnsi="Aptos"/>
+          <w:b w:val="0"/>
+          <w:i w:val="0"/>
+          <w:color w:val="1F3640"/>
+          <w:sz w:val="18"/>
+        </w:rPr>
+        <w:t xml:space="preserve"> Tools proven inside Marindustrial might later be adapted for other distributors and warehouses. This is separate from the internal case, is not counted in any benefit, and would first need agreement on ownership and rights (see the appendix).</w:t>
+      </w:r>
+    </w:p>
+    <w:p>
+      <w:pPr>
         <w:spacing w:before="180" w:after="160" w:line="274" w:lineRule="auto"/>
       </w:pPr>
       <w:r>
@@ -542,7 +577,7 @@
           <w:color w:val="118B92"/>
           <w:sz w:val="16"/>
         </w:rPr>
-        <w:t>MANAGEMENT BRIEF  /  OCTOBER 2026    •    02/07</w:t>
+        <w:t>MANAGEMENT BRIEF  /  OCTOBER 2026    •    02/08</w:t>
       </w:r>
     </w:p>
     <w:p>
@@ -1212,7 +1247,7 @@
           <w:color w:val="118B92"/>
           <w:sz w:val="16"/>
         </w:rPr>
-        <w:t>MANAGEMENT BRIEF  /  OCTOBER 2026    •    03/07</w:t>
+        <w:t>MANAGEMENT BRIEF  /  OCTOBER 2026    •    03/08</w:t>
       </w:r>
     </w:p>
     <w:p>
@@ -1878,7 +1913,7 @@
           <w:color w:val="118B92"/>
           <w:sz w:val="16"/>
         </w:rPr>
-        <w:t>MANAGEMENT BRIEF  /  OCTOBER 2026    •    04/07</w:t>
+        <w:t>MANAGEMENT BRIEF  /  OCTOBER 2026    •    04/08</w:t>
       </w:r>
     </w:p>
     <w:p>
@@ -2676,7 +2711,7 @@
           <w:color w:val="118B92"/>
           <w:sz w:val="16"/>
         </w:rPr>
-        <w:t>MANAGEMENT BRIEF  /  OCTOBER 2026    •    05/07</w:t>
+        <w:t>MANAGEMENT BRIEF  /  OCTOBER 2026    •    05/08</w:t>
       </w:r>
     </w:p>
     <w:p>
@@ -3159,7 +3194,7 @@
           <w:color w:val="118B92"/>
           <w:sz w:val="16"/>
         </w:rPr>
-        <w:t>MANAGEMENT BRIEF  /  OCTOBER 2026    •    06/07</w:t>
+        <w:t>MANAGEMENT BRIEF  /  OCTOBER 2026    •    06/08</w:t>
       </w:r>
     </w:p>
     <w:p>
@@ -3652,7 +3687,7 @@
           <w:color w:val="118B92"/>
           <w:sz w:val="16"/>
         </w:rPr>
-        <w:t>MANAGEMENT BRIEF  /  OCTOBER 2026    •    07/07</w:t>
+        <w:t>MANAGEMENT BRIEF  /  OCTOBER 2026    •    07/08</w:t>
       </w:r>
     </w:p>
     <w:p>
@@ -4259,6 +4294,469 @@
       </w:r>
     </w:p>
     <w:p>
+      <w:r>
+        <w:br w:type="page"/>
+      </w:r>
+    </w:p>
+    <w:p>
+      <w:pPr>
+        <w:spacing w:before="0" w:after="240" w:line="274" w:lineRule="auto"/>
+      </w:pPr>
+      <w:r>
+        <w:rPr>
+          <w:rFonts w:ascii="Aptos" w:hAnsi="Aptos"/>
+          <w:b/>
+          <w:i w:val="0"/>
+          <w:color w:val="118B92"/>
+          <w:sz w:val="16"/>
+        </w:rPr>
+        <w:t>MANAGEMENT BRIEF  /  OCTOBER 2026    •    08/08</w:t>
+      </w:r>
+    </w:p>
+    <w:p>
+      <w:pPr>
+        <w:spacing w:before="0" w:after="200" w:line="274" w:lineRule="auto"/>
+      </w:pPr>
+      <w:r>
+        <w:rPr>
+          <w:rFonts w:ascii="Aptos" w:hAnsi="Aptos"/>
+          <w:b/>
+          <w:i w:val="0"/>
+          <w:color w:val="193544"/>
+          <w:sz w:val="46"/>
+        </w:rPr>
+        <w:t>Appendix: future opportunities</w:t>
+      </w:r>
+    </w:p>
+    <w:p>
+      <w:pPr>
+        <w:spacing w:before="0" w:after="300" w:line="274" w:lineRule="auto"/>
+      </w:pPr>
+      <w:r>
+        <w:rPr>
+          <w:rFonts w:ascii="Aptos" w:hAnsi="Aptos"/>
+          <w:b w:val="0"/>
+          <w:i/>
+          <w:color w:val="526670"/>
+          <w:sz w:val="20"/>
+        </w:rPr>
+        <w:t>A backlog for later consideration. None of these is part of the 60-day request.</w:t>
+      </w:r>
+    </w:p>
+    <w:tbl>
+      <w:tblPr>
+        <w:tblW w:type="auto" w:w="0"/>
+        <w:tblLook w:firstColumn="1" w:firstRow="1" w:lastColumn="0" w:lastRow="0" w:noHBand="0" w:noVBand="1" w:val="04A0"/>
+        <w:tblBorders>
+          <w:top w:val="nil"/>
+          <w:bottom w:val="nil"/>
+          <w:left w:val="nil"/>
+          <w:right w:val="nil"/>
+          <w:insideV w:val="nil"/>
+          <w:insideH w:val="nil"/>
+        </w:tblBorders>
+      </w:tblPr>
+      <w:tblGrid>
+        <w:gridCol w:w="10080"/>
+      </w:tblGrid>
+      <w:tr>
+        <w:trPr>
+          <w:trHeight w:val="40" w:hRule="exact"/>
+        </w:trPr>
+        <w:tc>
+          <w:tcPr>
+            <w:tcW w:type="dxa" w:w="10080"/>
+            <w:shd w:fill="118B92"/>
+            <w:tcMar>
+              <w:top w:w="0" w:type="dxa"/>
+              <w:start w:w="0" w:type="dxa"/>
+              <w:bottom w:w="0" w:type="dxa"/>
+              <w:end w:w="0" w:type="dxa"/>
+            </w:tcMar>
+          </w:tcPr>
+          <w:p>
+            <w:pPr>
+              <w:spacing w:after="0"/>
+            </w:pPr>
+          </w:p>
+        </w:tc>
+      </w:tr>
+    </w:tbl>
+    <w:p>
+      <w:pPr>
+        <w:spacing w:before="0" w:after="180" w:line="274" w:lineRule="auto"/>
+      </w:pPr>
+      <w:r>
+        <w:rPr>
+          <w:rFonts w:ascii="Aptos" w:hAnsi="Aptos"/>
+          <w:b w:val="0"/>
+          <w:i w:val="0"/>
+          <w:color w:val="1F3640"/>
+          <w:sz w:val="2"/>
+        </w:rPr>
+      </w:r>
+    </w:p>
+    <w:p>
+      <w:pPr>
+        <w:spacing w:before="180" w:after="160" w:line="274" w:lineRule="auto"/>
+      </w:pPr>
+      <w:r>
+        <w:rPr>
+          <w:rFonts w:ascii="Aptos" w:hAnsi="Aptos"/>
+          <w:b/>
+          <w:i w:val="0"/>
+          <w:color w:val="118B92"/>
+          <w:sz w:val="19"/>
+        </w:rPr>
+        <w:t>NEAR-TERM OPPORTUNITIES (REVIEW AFTER THE FIRST PILOT RESULTS)</w:t>
+      </w:r>
+    </w:p>
+    <w:p>
+      <w:pPr>
+        <w:spacing w:after="120" w:line="281" w:lineRule="auto"/>
+      </w:pPr>
+      <w:r>
+        <w:rPr>
+          <w:rFonts w:ascii="Aptos" w:hAnsi="Aptos"/>
+          <w:b w:val="0"/>
+          <w:i w:val="0"/>
+          <w:color w:val="1F3640"/>
+          <w:sz w:val="18"/>
+        </w:rPr>
+        <w:t xml:space="preserve">•  </w:t>
+      </w:r>
+      <w:r>
+        <w:rPr>
+          <w:rFonts w:ascii="Aptos" w:hAnsi="Aptos"/>
+          <w:b/>
+          <w:i w:val="0"/>
+          <w:color w:val="193544"/>
+          <w:sz w:val="18"/>
+        </w:rPr>
+        <w:t>Direct-Ship Processing &amp; SAP Invoice Management.</w:t>
+      </w:r>
+      <w:r>
+        <w:rPr>
+          <w:rFonts w:ascii="Aptos" w:hAnsi="Aptos"/>
+          <w:b w:val="0"/>
+          <w:i w:val="0"/>
+          <w:color w:val="1F3640"/>
+          <w:sz w:val="18"/>
+        </w:rPr>
+        <w:t xml:space="preserve"> Reduce repeat handling of direct-ship transactions, invoice searches and document filing. First in line; scope and permissions still to be confirmed.</w:t>
+      </w:r>
+    </w:p>
+    <w:p>
+      <w:pPr>
+        <w:spacing w:after="120" w:line="281" w:lineRule="auto"/>
+      </w:pPr>
+      <w:r>
+        <w:rPr>
+          <w:rFonts w:ascii="Aptos" w:hAnsi="Aptos"/>
+          <w:b w:val="0"/>
+          <w:i w:val="0"/>
+          <w:color w:val="1F3640"/>
+          <w:sz w:val="18"/>
+        </w:rPr>
+        <w:t xml:space="preserve">•  </w:t>
+      </w:r>
+      <w:r>
+        <w:rPr>
+          <w:rFonts w:ascii="Aptos" w:hAnsi="Aptos"/>
+          <w:b/>
+          <w:i w:val="0"/>
+          <w:color w:val="193544"/>
+          <w:sz w:val="18"/>
+        </w:rPr>
+        <w:t>Invoice Retrieval.</w:t>
+      </w:r>
+      <w:r>
+        <w:rPr>
+          <w:rFonts w:ascii="Aptos" w:hAnsi="Aptos"/>
+          <w:b w:val="0"/>
+          <w:i w:val="0"/>
+          <w:color w:val="1F3640"/>
+          <w:sz w:val="18"/>
+        </w:rPr>
+        <w:t xml:space="preserve"> Search approved mailboxes and folders for supplier invoices. Earlier prototype; current status to be verified.</w:t>
+      </w:r>
+    </w:p>
+    <w:p>
+      <w:pPr>
+        <w:spacing w:after="120" w:line="281" w:lineRule="auto"/>
+      </w:pPr>
+      <w:r>
+        <w:rPr>
+          <w:rFonts w:ascii="Aptos" w:hAnsi="Aptos"/>
+          <w:b w:val="0"/>
+          <w:i w:val="0"/>
+          <w:color w:val="1F3640"/>
+          <w:sz w:val="18"/>
+        </w:rPr>
+        <w:t xml:space="preserve">•  </w:t>
+      </w:r>
+      <w:r>
+        <w:rPr>
+          <w:rFonts w:ascii="Aptos" w:hAnsi="Aptos"/>
+          <w:b/>
+          <w:i w:val="0"/>
+          <w:color w:val="193544"/>
+          <w:sz w:val="18"/>
+        </w:rPr>
+        <w:t>Invoice / PO / GRPO Comparator.</w:t>
+      </w:r>
+      <w:r>
+        <w:rPr>
+          <w:rFonts w:ascii="Aptos" w:hAnsi="Aptos"/>
+          <w:b w:val="0"/>
+          <w:i w:val="0"/>
+          <w:color w:val="1F3640"/>
+          <w:sz w:val="18"/>
+        </w:rPr>
+        <w:t xml:space="preserve"> Flag differences between purchase orders, receipts and invoices. Previously developed; deployment to be verified.</w:t>
+      </w:r>
+    </w:p>
+    <w:p>
+      <w:pPr>
+        <w:spacing w:after="120" w:line="281" w:lineRule="auto"/>
+      </w:pPr>
+      <w:r>
+        <w:rPr>
+          <w:rFonts w:ascii="Aptos" w:hAnsi="Aptos"/>
+          <w:b w:val="0"/>
+          <w:i w:val="0"/>
+          <w:color w:val="1F3640"/>
+          <w:sz w:val="18"/>
+        </w:rPr>
+        <w:t xml:space="preserve">•  </w:t>
+      </w:r>
+      <w:r>
+        <w:rPr>
+          <w:rFonts w:ascii="Aptos" w:hAnsi="Aptos"/>
+          <w:b/>
+          <w:i w:val="0"/>
+          <w:color w:val="193544"/>
+          <w:sz w:val="18"/>
+        </w:rPr>
+        <w:t>Landed Cost Reconciliation.</w:t>
+      </w:r>
+      <w:r>
+        <w:rPr>
+          <w:rFonts w:ascii="Aptos" w:hAnsi="Aptos"/>
+          <w:b w:val="0"/>
+          <w:i w:val="0"/>
+          <w:color w:val="1F3640"/>
+          <w:sz w:val="18"/>
+        </w:rPr>
+        <w:t xml:space="preserve"> Match freight and brokerage charges to receipts. Existing tool; needs review against current SAP data access.</w:t>
+      </w:r>
+    </w:p>
+    <w:p>
+      <w:pPr>
+        <w:spacing w:after="120" w:line="281" w:lineRule="auto"/>
+      </w:pPr>
+      <w:r>
+        <w:rPr>
+          <w:rFonts w:ascii="Aptos" w:hAnsi="Aptos"/>
+          <w:b w:val="0"/>
+          <w:i w:val="0"/>
+          <w:color w:val="1F3640"/>
+          <w:sz w:val="18"/>
+        </w:rPr>
+        <w:t xml:space="preserve">•  </w:t>
+      </w:r>
+      <w:r>
+        <w:rPr>
+          <w:rFonts w:ascii="Aptos" w:hAnsi="Aptos"/>
+          <w:b/>
+          <w:i w:val="0"/>
+          <w:color w:val="193544"/>
+          <w:sz w:val="18"/>
+        </w:rPr>
+        <w:t>Commercial Invoice Generator.</w:t>
+      </w:r>
+      <w:r>
+        <w:rPr>
+          <w:rFonts w:ascii="Aptos" w:hAnsi="Aptos"/>
+          <w:b w:val="0"/>
+          <w:i w:val="0"/>
+          <w:color w:val="1F3640"/>
+          <w:sz w:val="18"/>
+        </w:rPr>
+        <w:t xml:space="preserve"> Prepare international shipping documents from a few inputs, with human review of customs details.</w:t>
+      </w:r>
+    </w:p>
+    <w:p>
+      <w:pPr>
+        <w:spacing w:after="120" w:line="281" w:lineRule="auto"/>
+      </w:pPr>
+      <w:r>
+        <w:rPr>
+          <w:rFonts w:ascii="Aptos" w:hAnsi="Aptos"/>
+          <w:b w:val="0"/>
+          <w:i w:val="0"/>
+          <w:color w:val="1F3640"/>
+          <w:sz w:val="18"/>
+        </w:rPr>
+        <w:t xml:space="preserve">•  </w:t>
+      </w:r>
+      <w:r>
+        <w:rPr>
+          <w:rFonts w:ascii="Aptos" w:hAnsi="Aptos"/>
+          <w:b/>
+          <w:i w:val="0"/>
+          <w:color w:val="193544"/>
+          <w:sz w:val="18"/>
+        </w:rPr>
+        <w:t>Shipment Notifications.</w:t>
+      </w:r>
+      <w:r>
+        <w:rPr>
+          <w:rFonts w:ascii="Aptos" w:hAnsi="Aptos"/>
+          <w:b w:val="0"/>
+          <w:i w:val="0"/>
+          <w:color w:val="1F3640"/>
+          <w:sz w:val="18"/>
+        </w:rPr>
+        <w:t xml:space="preserve"> Send confirmations and tracking automatically to reduce manual emails.</w:t>
+      </w:r>
+    </w:p>
+    <w:p>
+      <w:pPr>
+        <w:spacing w:before="180" w:after="160" w:line="274" w:lineRule="auto"/>
+      </w:pPr>
+      <w:r>
+        <w:rPr>
+          <w:rFonts w:ascii="Aptos" w:hAnsi="Aptos"/>
+          <w:b/>
+          <w:i w:val="0"/>
+          <w:color w:val="118B92"/>
+          <w:sz w:val="19"/>
+        </w:rPr>
+        <w:t>LATER OPPORTUNITIES (CONCEPT STAGE)</w:t>
+      </w:r>
+    </w:p>
+    <w:p>
+      <w:pPr>
+        <w:spacing w:after="120" w:line="281" w:lineRule="auto"/>
+      </w:pPr>
+      <w:r>
+        <w:rPr>
+          <w:rFonts w:ascii="Aptos" w:hAnsi="Aptos"/>
+          <w:b w:val="0"/>
+          <w:i w:val="0"/>
+          <w:color w:val="1F3640"/>
+          <w:sz w:val="18"/>
+        </w:rPr>
+        <w:t>•  Customer order-status portal and customer service assistant</w:t>
+      </w:r>
+    </w:p>
+    <w:p>
+      <w:pPr>
+        <w:spacing w:after="120" w:line="281" w:lineRule="auto"/>
+      </w:pPr>
+      <w:r>
+        <w:rPr>
+          <w:rFonts w:ascii="Aptos" w:hAnsi="Aptos"/>
+          <w:b w:val="0"/>
+          <w:i w:val="0"/>
+          <w:color w:val="1F3640"/>
+          <w:sz w:val="18"/>
+        </w:rPr>
+        <w:t>•  Inventory and purchasing analytics, dormant-customer identification and product cross-sell analysis (extensions of the reporting pilot)</w:t>
+      </w:r>
+    </w:p>
+    <w:p>
+      <w:pPr>
+        <w:spacing w:after="120" w:line="281" w:lineRule="auto"/>
+      </w:pPr>
+      <w:r>
+        <w:rPr>
+          <w:rFonts w:ascii="Aptos" w:hAnsi="Aptos"/>
+          <w:b w:val="0"/>
+          <w:i w:val="0"/>
+          <w:color w:val="1F3640"/>
+          <w:sz w:val="18"/>
+        </w:rPr>
+        <w:t>•  SAP operations companion, GRPO document attachment and SAP document auto-print</w:t>
+      </w:r>
+    </w:p>
+    <w:p>
+      <w:pPr>
+        <w:spacing w:after="120" w:line="281" w:lineRule="auto"/>
+      </w:pPr>
+      <w:r>
+        <w:rPr>
+          <w:rFonts w:ascii="Aptos" w:hAnsi="Aptos"/>
+          <w:b w:val="0"/>
+          <w:i w:val="0"/>
+          <w:color w:val="1F3640"/>
+          <w:sz w:val="18"/>
+        </w:rPr>
+        <w:t>•  Teams operations task dashboard and internal information search</w:t>
+      </w:r>
+    </w:p>
+    <w:p>
+      <w:pPr>
+        <w:spacing w:after="120" w:line="281" w:lineRule="auto"/>
+      </w:pPr>
+      <w:r>
+        <w:rPr>
+          <w:rFonts w:ascii="Aptos" w:hAnsi="Aptos"/>
+          <w:b w:val="0"/>
+          <w:i w:val="0"/>
+          <w:color w:val="1F3640"/>
+          <w:sz w:val="18"/>
+        </w:rPr>
+        <w:t>•  Website and lead-capture improvements and market and competitor monitoring</w:t>
+      </w:r>
+    </w:p>
+    <w:p>
+      <w:pPr>
+        <w:spacing w:after="180" w:line="281" w:lineRule="auto"/>
+      </w:pPr>
+      <w:r>
+        <w:rPr>
+          <w:rFonts w:ascii="Aptos" w:hAnsi="Aptos"/>
+          <w:b w:val="0"/>
+          <w:i w:val="0"/>
+          <w:color w:val="1F3640"/>
+          <w:sz w:val="18"/>
+        </w:rPr>
+        <w:t>Receiving, putaway and wave picking are treated as modules of the RF Scanner project, not separate projects.</w:t>
+      </w:r>
+    </w:p>
+    <w:p>
+      <w:pPr>
+        <w:spacing w:before="180" w:after="160" w:line="274" w:lineRule="auto"/>
+      </w:pPr>
+      <w:r>
+        <w:rPr>
+          <w:rFonts w:ascii="Aptos" w:hAnsi="Aptos"/>
+          <w:b/>
+          <w:i w:val="0"/>
+          <w:color w:val="118B92"/>
+          <w:sz w:val="19"/>
+        </w:rPr>
+        <w:t>LONG-TERM COMMERCIALIZATION (SEPARATE FROM THE INTERNAL CASE)</w:t>
+      </w:r>
+    </w:p>
+    <w:p>
+      <w:pPr>
+        <w:spacing w:after="180" w:line="281" w:lineRule="auto"/>
+      </w:pPr>
+      <w:r>
+        <w:rPr>
+          <w:rFonts w:ascii="Aptos" w:hAnsi="Aptos"/>
+          <w:b w:val="0"/>
+          <w:i w:val="0"/>
+          <w:color w:val="1F3640"/>
+          <w:sz w:val="18"/>
+        </w:rPr>
+        <w:t>If a tool proves valuable inside Marindustrial, it could later be offered to other distributors or warehouses through licensing, setup and support. This would require, first: agreement on who owns the software and the right to sell it; evidence of customer demand and willingness to pay; carrier and SAP licensing terms; and the added cost of support and security. No revenue is assumed anywhere in this proposal.</w:t>
+      </w:r>
+    </w:p>
+    <w:p>
       <w:pPr>
         <w:spacing w:after="180" w:line="281" w:lineRule="auto"/>
       </w:pPr>

</xml_diff>